<commit_message>
Added gameplay and storyboad with minor revisions on game docu
</commit_message>
<xml_diff>
--- a/docu_gamedocumentation/main_draft.docx
+++ b/docu_gamedocumentation/main_draft.docx
@@ -37,9 +37,13 @@
     <w:sdt>
       <w:sdtPr>
         <w:rPr>
-          <w:rFonts w:ascii="Times New Roman" w:hAnsi="Times New Roman"/>
+          <w:rFonts w:ascii="Times New Roman" w:eastAsiaTheme="minorHAnsi" w:hAnsi="Times New Roman" w:cstheme="minorBidi"/>
           <w:color w:val="auto"/>
+          <w:kern w:val="2"/>
           <w:sz w:val="24"/>
+          <w:szCs w:val="24"/>
+          <w:lang w:val="en-PH"/>
+          <w14:ligatures w14:val="standardContextual"/>
         </w:rPr>
         <w:id w:val="-870757581"/>
         <w:docPartObj>
@@ -49,13 +53,8 @@
       </w:sdtPr>
       <w:sdtEndPr>
         <w:rPr>
-          <w:rFonts w:eastAsiaTheme="minorHAnsi" w:cstheme="minorBidi"/>
           <w:b/>
           <w:noProof/>
-          <w:kern w:val="2"/>
-          <w:szCs w:val="24"/>
-          <w:lang w:val="en-PH"/>
-          <w14:ligatures w14:val="standardContextual"/>
         </w:rPr>
       </w:sdtEndPr>
       <w:sdtContent>
@@ -79,9 +78,11 @@
         </w:p>
         <w:p>
           <w:pPr>
+            <w:pStyle w:val="TOC1"/>
+            <w:tabs>
+              <w:tab w:val="right" w:leader="dot" w:pos="9350"/>
+            </w:tabs>
             <w:rPr>
-              <w:b/>
-              <w:bCs/>
               <w:noProof/>
             </w:rPr>
           </w:pPr>
@@ -94,15 +95,344 @@
           <w:r>
             <w:fldChar w:fldCharType="separate"/>
           </w:r>
-          <w:r>
+          <w:hyperlink w:anchor="_Toc220391704" w:history="1">
+            <w:r>
+              <w:rPr>
+                <w:rStyle w:val="Hyperlink"/>
+                <w:noProof/>
+              </w:rPr>
+              <w:t>Scope</w:t>
+            </w:r>
+            <w:r>
+              <w:rPr>
+                <w:noProof/>
+                <w:webHidden/>
+              </w:rPr>
+              <w:tab/>
+            </w:r>
+            <w:r>
+              <w:rPr>
+                <w:noProof/>
+                <w:webHidden/>
+              </w:rPr>
+              <w:fldChar w:fldCharType="begin"/>
+            </w:r>
+            <w:r>
+              <w:rPr>
+                <w:noProof/>
+                <w:webHidden/>
+              </w:rPr>
+              <w:instrText xml:space="preserve"> PAGEREF _Toc220391704 \h </w:instrText>
+            </w:r>
+            <w:r>
+              <w:rPr>
+                <w:noProof/>
+                <w:webHidden/>
+              </w:rPr>
+            </w:r>
+            <w:r>
+              <w:rPr>
+                <w:noProof/>
+                <w:webHidden/>
+              </w:rPr>
+              <w:fldChar w:fldCharType="separate"/>
+            </w:r>
+            <w:r>
+              <w:rPr>
+                <w:noProof/>
+                <w:webHidden/>
+              </w:rPr>
+              <w:t>3</w:t>
+            </w:r>
+            <w:r>
+              <w:rPr>
+                <w:noProof/>
+                <w:webHidden/>
+              </w:rPr>
+              <w:fldChar w:fldCharType="end"/>
+            </w:r>
+          </w:hyperlink>
+        </w:p>
+        <w:p>
+          <w:pPr>
+            <w:pStyle w:val="TOC2"/>
+            <w:tabs>
+              <w:tab w:val="right" w:leader="dot" w:pos="9350"/>
+            </w:tabs>
+            <w:rPr>
+              <w:noProof/>
+            </w:rPr>
+          </w:pPr>
+          <w:hyperlink w:anchor="_Toc220391705" w:history="1">
+            <w:r>
+              <w:rPr>
+                <w:rStyle w:val="Hyperlink"/>
+                <w:noProof/>
+              </w:rPr>
+              <w:t>User Interface</w:t>
+            </w:r>
+            <w:r>
+              <w:rPr>
+                <w:noProof/>
+                <w:webHidden/>
+              </w:rPr>
+              <w:tab/>
+            </w:r>
+            <w:r>
+              <w:rPr>
+                <w:noProof/>
+                <w:webHidden/>
+              </w:rPr>
+              <w:fldChar w:fldCharType="begin"/>
+            </w:r>
+            <w:r>
+              <w:rPr>
+                <w:noProof/>
+                <w:webHidden/>
+              </w:rPr>
+              <w:instrText xml:space="preserve"> PAGEREF _Toc220391705 \h </w:instrText>
+            </w:r>
+            <w:r>
+              <w:rPr>
+                <w:noProof/>
+                <w:webHidden/>
+              </w:rPr>
+            </w:r>
+            <w:r>
+              <w:rPr>
+                <w:noProof/>
+                <w:webHidden/>
+              </w:rPr>
+              <w:fldChar w:fldCharType="separate"/>
+            </w:r>
+            <w:r>
+              <w:rPr>
+                <w:noProof/>
+                <w:webHidden/>
+              </w:rPr>
+              <w:t>3</w:t>
+            </w:r>
+            <w:r>
+              <w:rPr>
+                <w:noProof/>
+                <w:webHidden/>
+              </w:rPr>
+              <w:fldChar w:fldCharType="end"/>
+            </w:r>
+          </w:hyperlink>
+        </w:p>
+        <w:p>
+          <w:pPr>
+            <w:pStyle w:val="TOC2"/>
+            <w:tabs>
+              <w:tab w:val="right" w:leader="dot" w:pos="9350"/>
+            </w:tabs>
+            <w:rPr>
+              <w:noProof/>
+            </w:rPr>
+          </w:pPr>
+          <w:hyperlink w:anchor="_Toc220391706" w:history="1">
+            <w:r>
+              <w:rPr>
+                <w:rStyle w:val="Hyperlink"/>
+                <w:noProof/>
+              </w:rPr>
+              <w:t>Gameplay Scope</w:t>
+            </w:r>
+            <w:r>
+              <w:rPr>
+                <w:noProof/>
+                <w:webHidden/>
+              </w:rPr>
+              <w:tab/>
+            </w:r>
+            <w:r>
+              <w:rPr>
+                <w:noProof/>
+                <w:webHidden/>
+              </w:rPr>
+              <w:fldChar w:fldCharType="begin"/>
+            </w:r>
+            <w:r>
+              <w:rPr>
+                <w:noProof/>
+                <w:webHidden/>
+              </w:rPr>
+              <w:instrText xml:space="preserve"> PAGEREF _Toc220391706 \h </w:instrText>
+            </w:r>
+            <w:r>
+              <w:rPr>
+                <w:noProof/>
+                <w:webHidden/>
+              </w:rPr>
+            </w:r>
+            <w:r>
+              <w:rPr>
+                <w:noProof/>
+                <w:webHidden/>
+              </w:rPr>
+              <w:fldChar w:fldCharType="separate"/>
+            </w:r>
+            <w:r>
+              <w:rPr>
+                <w:noProof/>
+                <w:webHidden/>
+              </w:rPr>
+              <w:t>4</w:t>
+            </w:r>
+            <w:r>
+              <w:rPr>
+                <w:noProof/>
+                <w:webHidden/>
+              </w:rPr>
+              <w:fldChar w:fldCharType="end"/>
+            </w:r>
+          </w:hyperlink>
+        </w:p>
+        <w:p>
+          <w:pPr>
+            <w:pStyle w:val="TOC1"/>
+            <w:tabs>
+              <w:tab w:val="right" w:leader="dot" w:pos="9350"/>
+            </w:tabs>
+            <w:rPr>
+              <w:noProof/>
+            </w:rPr>
+          </w:pPr>
+          <w:hyperlink w:anchor="_Toc220391707" w:history="1">
+            <w:r>
+              <w:rPr>
+                <w:rStyle w:val="Hyperlink"/>
+                <w:noProof/>
+              </w:rPr>
+              <w:t>Core Gameplay Mechanics</w:t>
+            </w:r>
+            <w:r>
+              <w:rPr>
+                <w:noProof/>
+                <w:webHidden/>
+              </w:rPr>
+              <w:tab/>
+            </w:r>
+            <w:r>
+              <w:rPr>
+                <w:noProof/>
+                <w:webHidden/>
+              </w:rPr>
+              <w:fldChar w:fldCharType="begin"/>
+            </w:r>
+            <w:r>
+              <w:rPr>
+                <w:noProof/>
+                <w:webHidden/>
+              </w:rPr>
+              <w:instrText xml:space="preserve"> PAGEREF _Toc220391707 \h </w:instrText>
+            </w:r>
+            <w:r>
+              <w:rPr>
+                <w:noProof/>
+                <w:webHidden/>
+              </w:rPr>
+            </w:r>
+            <w:r>
+              <w:rPr>
+                <w:noProof/>
+                <w:webHidden/>
+              </w:rPr>
+              <w:fldChar w:fldCharType="separate"/>
+            </w:r>
+            <w:r>
+              <w:rPr>
+                <w:noProof/>
+                <w:webHidden/>
+              </w:rPr>
+              <w:t>5</w:t>
+            </w:r>
+            <w:r>
+              <w:rPr>
+                <w:noProof/>
+                <w:webHidden/>
+              </w:rPr>
+              <w:fldChar w:fldCharType="end"/>
+            </w:r>
+          </w:hyperlink>
+        </w:p>
+        <w:p>
+          <w:pPr>
+            <w:pStyle w:val="TOC1"/>
+            <w:tabs>
+              <w:tab w:val="right" w:leader="dot" w:pos="9350"/>
+            </w:tabs>
+            <w:rPr>
+              <w:noProof/>
+            </w:rPr>
+          </w:pPr>
+          <w:hyperlink w:anchor="_Toc220391708" w:history="1">
+            <w:r>
+              <w:rPr>
+                <w:rStyle w:val="Hyperlink"/>
+                <w:noProof/>
+              </w:rPr>
+              <w:t>Gameplay</w:t>
+            </w:r>
+            <w:r>
+              <w:rPr>
+                <w:noProof/>
+                <w:webHidden/>
+              </w:rPr>
+              <w:tab/>
+            </w:r>
+            <w:r>
+              <w:rPr>
+                <w:noProof/>
+                <w:webHidden/>
+              </w:rPr>
+              <w:fldChar w:fldCharType="begin"/>
+            </w:r>
+            <w:r>
+              <w:rPr>
+                <w:noProof/>
+                <w:webHidden/>
+              </w:rPr>
+              <w:instrText xml:space="preserve"> PAGEREF _Toc220391708 \h </w:instrText>
+            </w:r>
+            <w:r>
+              <w:rPr>
+                <w:noProof/>
+                <w:webHidden/>
+              </w:rPr>
+            </w:r>
+            <w:r>
+              <w:rPr>
+                <w:noProof/>
+                <w:webHidden/>
+              </w:rPr>
+              <w:fldChar w:fldCharType="separate"/>
+            </w:r>
+            <w:r>
+              <w:rPr>
+                <w:noProof/>
+                <w:webHidden/>
+              </w:rPr>
+              <w:t>7</w:t>
+            </w:r>
+            <w:r>
+              <w:rPr>
+                <w:noProof/>
+                <w:webHidden/>
+              </w:rPr>
+              <w:fldChar w:fldCharType="end"/>
+            </w:r>
+          </w:hyperlink>
+        </w:p>
+        <w:p>
+          <w:pPr>
             <w:rPr>
               <w:b/>
               <w:bCs/>
               <w:noProof/>
-              <w:lang w:val="en-US"/>
             </w:rPr>
-            <w:t>No table of contents entries found.</w:t>
-          </w:r>
+          </w:pPr>
           <w:r>
             <w:rPr>
               <w:b/>
@@ -137,10 +467,12 @@
       <w:pPr>
         <w:pStyle w:val="Heading1"/>
       </w:pPr>
+      <w:bookmarkStart w:id="1" w:name="_Toc220391704"/>
       <w:r>
         <w:lastRenderedPageBreak/>
         <w:t>Scope</w:t>
       </w:r>
+      <w:bookmarkEnd w:id="1"/>
     </w:p>
     <w:p>
       <w:proofErr w:type="spellStart"/>
@@ -161,9 +493,11 @@
       <w:pPr>
         <w:pStyle w:val="Heading2"/>
       </w:pPr>
+      <w:bookmarkStart w:id="2" w:name="_Toc220391705"/>
       <w:r>
         <w:t>User Interface</w:t>
       </w:r>
+      <w:bookmarkEnd w:id="2"/>
     </w:p>
     <w:p>
       <w:pPr>
@@ -462,6 +796,7 @@
           <w:color w:val="auto"/>
         </w:rPr>
       </w:pPr>
+      <w:bookmarkStart w:id="3" w:name="_Toc220391706"/>
       <w:r>
         <w:rPr>
           <w:rStyle w:val="SubtleEmphasis"/>
@@ -472,6 +807,7 @@
         <w:lastRenderedPageBreak/>
         <w:t>Gameplay Scope</w:t>
       </w:r>
+      <w:bookmarkEnd w:id="3"/>
     </w:p>
     <w:p>
       <w:pPr>
@@ -484,118 +820,67 @@
     <w:p>
       <w:pPr>
         <w:pStyle w:val="PL-Level2"/>
-        <w:rPr>
-          <w:highlight w:val="yellow"/>
-        </w:rPr>
-      </w:pPr>
-      <w:r>
-        <w:rPr>
-          <w:highlight w:val="yellow"/>
-        </w:rPr>
+      </w:pPr>
+      <w:r>
         <w:t>Interactable Objects</w:t>
       </w:r>
       <w:r>
-        <w:rPr>
-          <w:highlight w:val="yellow"/>
-        </w:rPr>
         <w:t xml:space="preserve"> &lt;NAMES TO BE CHANGED&gt;</w:t>
       </w:r>
     </w:p>
     <w:p>
       <w:pPr>
         <w:pStyle w:val="IndentNormal-Level2"/>
-        <w:rPr>
-          <w:highlight w:val="yellow"/>
-        </w:rPr>
-      </w:pPr>
-      <w:r>
-        <w:rPr>
-          <w:highlight w:val="yellow"/>
-        </w:rPr>
+      </w:pPr>
+      <w:r>
         <w:t>Includes procedurally generated objects and player induced interactable objects.</w:t>
       </w:r>
     </w:p>
     <w:p>
       <w:pPr>
         <w:pStyle w:val="PL-Level3"/>
-        <w:rPr>
-          <w:highlight w:val="yellow"/>
-        </w:rPr>
-      </w:pPr>
-      <w:r>
-        <w:rPr>
-          <w:highlight w:val="yellow"/>
-        </w:rPr>
+      </w:pPr>
+      <w:r>
         <w:t>Crafting Station</w:t>
       </w:r>
     </w:p>
     <w:p>
       <w:pPr>
         <w:pStyle w:val="PL-Level3"/>
-        <w:rPr>
-          <w:highlight w:val="yellow"/>
-        </w:rPr>
-      </w:pPr>
-      <w:r>
-        <w:rPr>
-          <w:highlight w:val="yellow"/>
-        </w:rPr>
+      </w:pPr>
+      <w:r>
         <w:t>Smelting Station</w:t>
       </w:r>
     </w:p>
     <w:p>
       <w:pPr>
         <w:pStyle w:val="PL-Level3"/>
-        <w:rPr>
-          <w:highlight w:val="yellow"/>
-        </w:rPr>
-      </w:pPr>
-      <w:r>
-        <w:rPr>
-          <w:highlight w:val="yellow"/>
-        </w:rPr>
+      </w:pPr>
+      <w:r>
         <w:t>Cooking Station</w:t>
       </w:r>
     </w:p>
     <w:p>
       <w:pPr>
         <w:pStyle w:val="PL-Level2"/>
-        <w:rPr>
-          <w:highlight w:val="yellow"/>
-        </w:rPr>
-      </w:pPr>
-      <w:r>
-        <w:rPr>
-          <w:highlight w:val="yellow"/>
-        </w:rPr>
+      </w:pPr>
+      <w:r>
         <w:t>Trees</w:t>
       </w:r>
     </w:p>
     <w:p>
       <w:pPr>
         <w:pStyle w:val="IndentNormal-Level2"/>
-        <w:rPr>
-          <w:highlight w:val="yellow"/>
-        </w:rPr>
-      </w:pPr>
-      <w:r>
-        <w:rPr>
-          <w:highlight w:val="yellow"/>
-        </w:rPr>
+      </w:pPr>
+      <w:r>
         <w:t>The player would be able to chop down the trees and gather them as resources for crafting.</w:t>
       </w:r>
     </w:p>
     <w:p>
       <w:pPr>
         <w:pStyle w:val="PL-Level2"/>
-        <w:rPr>
-          <w:highlight w:val="yellow"/>
-        </w:rPr>
-      </w:pPr>
-      <w:r>
-        <w:rPr>
-          <w:highlight w:val="yellow"/>
-        </w:rPr>
+      </w:pPr>
+      <w:r>
         <w:t>Bodies of water</w:t>
       </w:r>
     </w:p>
@@ -604,9 +889,6 @@
         <w:pStyle w:val="IndentNormal-Level2"/>
       </w:pPr>
       <w:r>
-        <w:rPr>
-          <w:highlight w:val="yellow"/>
-        </w:rPr>
         <w:t>This area is interactable by the player and servers as a dedicated source of water.</w:t>
       </w:r>
     </w:p>
@@ -754,6 +1036,7 @@
           <w:color w:val="auto"/>
         </w:rPr>
       </w:pPr>
+      <w:bookmarkStart w:id="4" w:name="_Toc220391707"/>
       <w:r>
         <w:rPr>
           <w:rStyle w:val="SubtleEmphasis"/>
@@ -764,6 +1047,7 @@
         <w:lastRenderedPageBreak/>
         <w:t>Core Gameplay Mechanics</w:t>
       </w:r>
+      <w:bookmarkEnd w:id="4"/>
     </w:p>
     <w:p>
       <w:pPr>
@@ -809,7 +1093,7 @@
     </w:p>
     <w:p>
       <w:pPr>
-        <w:pStyle w:val="PL-Level2"/>
+        <w:pStyle w:val="IndentNormal"/>
       </w:pPr>
       <w:r>
         <w:t xml:space="preserve">Robot-like </w:t>
@@ -825,7 +1109,7 @@
     </w:p>
     <w:p>
       <w:pPr>
-        <w:pStyle w:val="PL-Level2"/>
+        <w:pStyle w:val="IndentNormal"/>
       </w:pPr>
       <w:proofErr w:type="spellStart"/>
       <w:r>
@@ -848,7 +1132,7 @@
     </w:p>
     <w:p>
       <w:pPr>
-        <w:pStyle w:val="PL-Level2"/>
+        <w:pStyle w:val="IndentNormal"/>
       </w:pPr>
       <w:r>
         <w:t>Allows the user to imbue regular items with automation by programming it through Python, unlockable through the Python-focused challenge areas.</w:t>
@@ -872,7 +1156,7 @@
     </w:p>
     <w:p>
       <w:pPr>
-        <w:pStyle w:val="PL-Level2"/>
+        <w:pStyle w:val="IndentNormal"/>
       </w:pPr>
       <w:r>
         <w:t xml:space="preserve">Missions are based on the </w:t>
@@ -1077,13 +1361,377 @@
     </w:p>
     <w:p>
       <w:pPr>
+        <w:pStyle w:val="ListParagraph"/>
+      </w:pPr>
+      <w:r>
+        <w:t>Progression</w:t>
+      </w:r>
+    </w:p>
+    <w:p>
+      <w:pPr>
         <w:pStyle w:val="IndentNormal"/>
       </w:pPr>
-    </w:p>
-    <w:p>
-      <w:pPr>
-        <w:pStyle w:val="IndentNormal"/>
-      </w:pPr>
+      <w:r>
+        <w:t xml:space="preserve">Progression can be measured by coding knowledge of the player, the more coding he can do the more utility he can add to the </w:t>
+      </w:r>
+      <w:proofErr w:type="spellStart"/>
+      <w:r>
+        <w:t>Automatica</w:t>
+      </w:r>
+      <w:proofErr w:type="spellEnd"/>
+      <w:r>
+        <w:t xml:space="preserve"> and </w:t>
+      </w:r>
+      <w:proofErr w:type="spellStart"/>
+      <w:r>
+        <w:t>Algorithmica</w:t>
+      </w:r>
+      <w:proofErr w:type="spellEnd"/>
+      <w:r>
+        <w:t xml:space="preserve">. Adding code to </w:t>
+      </w:r>
+      <w:proofErr w:type="spellStart"/>
+      <w:r>
+        <w:t>automatica</w:t>
+      </w:r>
+      <w:proofErr w:type="spellEnd"/>
+      <w:r>
+        <w:t xml:space="preserve"> allows it to be automated and adding code to </w:t>
+      </w:r>
+      <w:proofErr w:type="spellStart"/>
+      <w:r>
+        <w:t>Algorithmica</w:t>
+      </w:r>
+      <w:proofErr w:type="spellEnd"/>
+      <w:r>
+        <w:t xml:space="preserve"> allows items to have more damage and inflict additional effects.</w:t>
+      </w:r>
+    </w:p>
+    <w:p>
+      <w:pPr>
+        <w:spacing w:line="278" w:lineRule="auto"/>
+        <w:jc w:val="left"/>
+      </w:pPr>
+      <w:r>
+        <w:br w:type="page"/>
+      </w:r>
+    </w:p>
+    <w:p>
+      <w:pPr>
+        <w:pStyle w:val="Heading1"/>
+      </w:pPr>
+      <w:bookmarkStart w:id="5" w:name="_Toc220391708"/>
+      <w:r>
+        <w:lastRenderedPageBreak/>
+        <w:t>Gameplay</w:t>
+      </w:r>
+      <w:bookmarkEnd w:id="5"/>
+    </w:p>
+    <w:p>
+      <w:pPr>
+        <w:pStyle w:val="ListParagraph"/>
+      </w:pPr>
+      <w:r>
+        <w:t>Player spawns in a natural world.</w:t>
+      </w:r>
+    </w:p>
+    <w:p>
+      <w:pPr>
+        <w:pStyle w:val="ListParagraph"/>
+      </w:pPr>
+      <w:r>
+        <w:t>Players gather resources to craft items and place objects on the world.</w:t>
+      </w:r>
+    </w:p>
+    <w:p>
+      <w:pPr>
+        <w:pStyle w:val="ListParagraph"/>
+      </w:pPr>
+      <w:r>
+        <w:t xml:space="preserve">Players add utility by coding </w:t>
+      </w:r>
+    </w:p>
+    <w:p>
+      <w:pPr>
+        <w:pStyle w:val="ListParagraph"/>
+      </w:pPr>
+      <w:r>
+        <w:t>Player tackle missions by utilizing the items they have imbued with coding.</w:t>
+      </w:r>
+    </w:p>
+    <w:p>
+      <w:pPr>
+        <w:pStyle w:val="ListParagraph"/>
+      </w:pPr>
+      <w:r>
+        <w:t>Players unlock more challenges by completing previous missions.</w:t>
+      </w:r>
+    </w:p>
+    <w:p/>
+    <w:p>
+      <w:pPr>
+        <w:spacing w:line="278" w:lineRule="auto"/>
+        <w:jc w:val="left"/>
+        <w:rPr>
+          <w:rFonts w:eastAsiaTheme="majorEastAsia" w:cstheme="majorBidi"/>
+          <w:b/>
+          <w:szCs w:val="40"/>
+        </w:rPr>
+      </w:pPr>
+      <w:r>
+        <w:br w:type="page"/>
+      </w:r>
+    </w:p>
+    <w:p>
+      <w:pPr>
+        <w:pStyle w:val="Heading1"/>
+      </w:pPr>
+      <w:r>
+        <w:lastRenderedPageBreak/>
+        <w:t>Storyboard</w:t>
+      </w:r>
+    </w:p>
+    <w:p>
+      <w:r>
+        <w:rPr>
+          <w:noProof/>
+        </w:rPr>
+        <w:drawing>
+          <wp:inline distT="0" distB="0" distL="0" distR="0" wp14:anchorId="20B1DAE6" wp14:editId="597CA047">
+            <wp:extent cx="5943600" cy="3343275"/>
+            <wp:effectExtent l="0" t="0" r="0" b="9525"/>
+            <wp:docPr id="639110975" name="Picture 2"/>
+            <wp:cNvGraphicFramePr>
+              <a:graphicFrameLocks xmlns:a="http://schemas.openxmlformats.org/drawingml/2006/main" noChangeAspect="1"/>
+            </wp:cNvGraphicFramePr>
+            <a:graphic xmlns:a="http://schemas.openxmlformats.org/drawingml/2006/main">
+              <a:graphicData uri="http://schemas.openxmlformats.org/drawingml/2006/picture">
+                <pic:pic xmlns:pic="http://schemas.openxmlformats.org/drawingml/2006/picture">
+                  <pic:nvPicPr>
+                    <pic:cNvPr id="639110975" name="Picture 639110975"/>
+                    <pic:cNvPicPr/>
+                  </pic:nvPicPr>
+                  <pic:blipFill>
+                    <a:blip r:embed="rId6">
+                      <a:extLst>
+                        <a:ext uri="{28A0092B-C50C-407E-A947-70E740481C1C}">
+                          <a14:useLocalDpi xmlns:a14="http://schemas.microsoft.com/office/drawing/2010/main" val="0"/>
+                        </a:ext>
+                      </a:extLst>
+                    </a:blip>
+                    <a:stretch>
+                      <a:fillRect/>
+                    </a:stretch>
+                  </pic:blipFill>
+                  <pic:spPr>
+                    <a:xfrm>
+                      <a:off x="0" y="0"/>
+                      <a:ext cx="5943600" cy="3343275"/>
+                    </a:xfrm>
+                    <a:prstGeom prst="rect">
+                      <a:avLst/>
+                    </a:prstGeom>
+                  </pic:spPr>
+                </pic:pic>
+              </a:graphicData>
+            </a:graphic>
+          </wp:inline>
+        </w:drawing>
+      </w:r>
+    </w:p>
+    <w:p>
+      <w:pPr>
+        <w:pStyle w:val="Quote"/>
+      </w:pPr>
+      <w:r>
+        <w:t>Player interacting with a tree.</w:t>
+      </w:r>
+    </w:p>
+    <w:p>
+      <w:r>
+        <w:rPr>
+          <w:noProof/>
+        </w:rPr>
+        <w:drawing>
+          <wp:inline distT="0" distB="0" distL="0" distR="0" wp14:anchorId="280683B1" wp14:editId="0D5F3D0A">
+            <wp:extent cx="5943600" cy="3343275"/>
+            <wp:effectExtent l="0" t="0" r="0" b="9525"/>
+            <wp:docPr id="442808189" name="Picture 3"/>
+            <wp:cNvGraphicFramePr>
+              <a:graphicFrameLocks xmlns:a="http://schemas.openxmlformats.org/drawingml/2006/main" noChangeAspect="1"/>
+            </wp:cNvGraphicFramePr>
+            <a:graphic xmlns:a="http://schemas.openxmlformats.org/drawingml/2006/main">
+              <a:graphicData uri="http://schemas.openxmlformats.org/drawingml/2006/picture">
+                <pic:pic xmlns:pic="http://schemas.openxmlformats.org/drawingml/2006/picture">
+                  <pic:nvPicPr>
+                    <pic:cNvPr id="442808189" name="Picture 442808189"/>
+                    <pic:cNvPicPr/>
+                  </pic:nvPicPr>
+                  <pic:blipFill>
+                    <a:blip r:embed="rId7">
+                      <a:extLst>
+                        <a:ext uri="{28A0092B-C50C-407E-A947-70E740481C1C}">
+                          <a14:useLocalDpi xmlns:a14="http://schemas.microsoft.com/office/drawing/2010/main" val="0"/>
+                        </a:ext>
+                      </a:extLst>
+                    </a:blip>
+                    <a:stretch>
+                      <a:fillRect/>
+                    </a:stretch>
+                  </pic:blipFill>
+                  <pic:spPr>
+                    <a:xfrm>
+                      <a:off x="0" y="0"/>
+                      <a:ext cx="5943600" cy="3343275"/>
+                    </a:xfrm>
+                    <a:prstGeom prst="rect">
+                      <a:avLst/>
+                    </a:prstGeom>
+                  </pic:spPr>
+                </pic:pic>
+              </a:graphicData>
+            </a:graphic>
+          </wp:inline>
+        </w:drawing>
+      </w:r>
+    </w:p>
+    <w:p>
+      <w:pPr>
+        <w:pStyle w:val="Quote"/>
+      </w:pPr>
+      <w:r>
+        <w:t>Player collecting resources from a tree.</w:t>
+      </w:r>
+    </w:p>
+    <w:p>
+      <w:pPr>
+        <w:spacing w:line="278" w:lineRule="auto"/>
+        <w:jc w:val="left"/>
+        <w:rPr>
+          <w:i/>
+          <w:iCs/>
+          <w:color w:val="404040" w:themeColor="text1" w:themeTint="BF"/>
+        </w:rPr>
+      </w:pPr>
+      <w:r>
+        <w:br w:type="page"/>
+      </w:r>
+    </w:p>
+    <w:p>
+      <w:pPr>
+        <w:pStyle w:val="Quote"/>
+      </w:pPr>
+      <w:r>
+        <w:rPr>
+          <w:noProof/>
+        </w:rPr>
+        <w:lastRenderedPageBreak/>
+        <w:drawing>
+          <wp:inline distT="0" distB="0" distL="0" distR="0" wp14:anchorId="422193B4" wp14:editId="4B27E766">
+            <wp:extent cx="5943600" cy="3343275"/>
+            <wp:effectExtent l="0" t="0" r="0" b="9525"/>
+            <wp:docPr id="532536847" name="Picture 4"/>
+            <wp:cNvGraphicFramePr>
+              <a:graphicFrameLocks xmlns:a="http://schemas.openxmlformats.org/drawingml/2006/main" noChangeAspect="1"/>
+            </wp:cNvGraphicFramePr>
+            <a:graphic xmlns:a="http://schemas.openxmlformats.org/drawingml/2006/main">
+              <a:graphicData uri="http://schemas.openxmlformats.org/drawingml/2006/picture">
+                <pic:pic xmlns:pic="http://schemas.openxmlformats.org/drawingml/2006/picture">
+                  <pic:nvPicPr>
+                    <pic:cNvPr id="532536847" name="Picture 532536847"/>
+                    <pic:cNvPicPr/>
+                  </pic:nvPicPr>
+                  <pic:blipFill>
+                    <a:blip r:embed="rId8">
+                      <a:extLst>
+                        <a:ext uri="{28A0092B-C50C-407E-A947-70E740481C1C}">
+                          <a14:useLocalDpi xmlns:a14="http://schemas.microsoft.com/office/drawing/2010/main" val="0"/>
+                        </a:ext>
+                      </a:extLst>
+                    </a:blip>
+                    <a:stretch>
+                      <a:fillRect/>
+                    </a:stretch>
+                  </pic:blipFill>
+                  <pic:spPr>
+                    <a:xfrm>
+                      <a:off x="0" y="0"/>
+                      <a:ext cx="5943600" cy="3343275"/>
+                    </a:xfrm>
+                    <a:prstGeom prst="rect">
+                      <a:avLst/>
+                    </a:prstGeom>
+                  </pic:spPr>
+                </pic:pic>
+              </a:graphicData>
+            </a:graphic>
+          </wp:inline>
+        </w:drawing>
+      </w:r>
+    </w:p>
+    <w:p>
+      <w:pPr>
+        <w:pStyle w:val="Quote"/>
+      </w:pPr>
+      <w:r>
+        <w:t>Player interacting with a crafting station</w:t>
+      </w:r>
+    </w:p>
+    <w:p>
+      <w:r>
+        <w:rPr>
+          <w:noProof/>
+        </w:rPr>
+        <w:drawing>
+          <wp:inline distT="0" distB="0" distL="0" distR="0" wp14:anchorId="44F418B1" wp14:editId="0F099C66">
+            <wp:extent cx="5943600" cy="3343275"/>
+            <wp:effectExtent l="0" t="0" r="0" b="9525"/>
+            <wp:docPr id="1021682486" name="Picture 5"/>
+            <wp:cNvGraphicFramePr>
+              <a:graphicFrameLocks xmlns:a="http://schemas.openxmlformats.org/drawingml/2006/main" noChangeAspect="1"/>
+            </wp:cNvGraphicFramePr>
+            <a:graphic xmlns:a="http://schemas.openxmlformats.org/drawingml/2006/main">
+              <a:graphicData uri="http://schemas.openxmlformats.org/drawingml/2006/picture">
+                <pic:pic xmlns:pic="http://schemas.openxmlformats.org/drawingml/2006/picture">
+                  <pic:nvPicPr>
+                    <pic:cNvPr id="1021682486" name="Picture 1021682486"/>
+                    <pic:cNvPicPr/>
+                  </pic:nvPicPr>
+                  <pic:blipFill>
+                    <a:blip r:embed="rId9">
+                      <a:extLst>
+                        <a:ext uri="{28A0092B-C50C-407E-A947-70E740481C1C}">
+                          <a14:useLocalDpi xmlns:a14="http://schemas.microsoft.com/office/drawing/2010/main" val="0"/>
+                        </a:ext>
+                      </a:extLst>
+                    </a:blip>
+                    <a:stretch>
+                      <a:fillRect/>
+                    </a:stretch>
+                  </pic:blipFill>
+                  <pic:spPr>
+                    <a:xfrm>
+                      <a:off x="0" y="0"/>
+                      <a:ext cx="5943600" cy="3343275"/>
+                    </a:xfrm>
+                    <a:prstGeom prst="rect">
+                      <a:avLst/>
+                    </a:prstGeom>
+                  </pic:spPr>
+                </pic:pic>
+              </a:graphicData>
+            </a:graphic>
+          </wp:inline>
+        </w:drawing>
+      </w:r>
+    </w:p>
+    <w:p>
+      <w:pPr>
+        <w:pStyle w:val="Quote"/>
+      </w:pPr>
+      <w:r>
+        <w:t>Player crafting items</w:t>
+      </w:r>
     </w:p>
     <w:sectPr>
       <w:pgSz w:w="12240" w:h="15840"/>
@@ -1098,6 +1746,119 @@
 <file path=word/numbering.xml><?xml version="1.0" encoding="utf-8"?>
 <w:numbering xmlns:wpc="http://schemas.microsoft.com/office/word/2010/wordprocessingCanvas" xmlns:cx="http://schemas.microsoft.com/office/drawing/2014/chartex" xmlns:cx1="http://schemas.microsoft.com/office/drawing/2015/9/8/chartex" xmlns:cx2="http://schemas.microsoft.com/office/drawing/2015/10/21/chartex" xmlns:cx3="http://schemas.microsoft.com/office/drawing/2016/5/9/chartex" xmlns:cx4="http://schemas.microsoft.com/office/drawing/2016/5/10/chartex" xmlns:cx5="http://schemas.microsoft.com/office/drawing/2016/5/11/chartex" xmlns:cx6="http://schemas.microsoft.com/office/drawing/2016/5/12/chartex" xmlns:cx7="http://schemas.microsoft.com/office/drawing/2016/5/13/chartex" xmlns:cx8="http://schemas.microsoft.com/office/drawing/2016/5/14/chartex" xmlns:mc="http://schemas.openxmlformats.org/markup-compatibility/2006" xmlns:aink="http://schemas.microsoft.com/office/drawing/2016/ink" xmlns:am3d="http://schemas.microsoft.com/office/drawing/2017/model3d" xmlns:o="urn:schemas-microsoft-com:office:office" xmlns:oel="http://schemas.microsoft.com/office/2019/extlst" xmlns:r="http://schemas.openxmlformats.org/officeDocument/2006/relationships" xmlns:m="http://schemas.openxmlformats.org/officeDocument/2006/math" xmlns:v="urn:schemas-microsoft-com:vml" xmlns:wp14="http://schemas.microsoft.com/office/word/2010/wordprocessingDrawing" xmlns:wp="http://schemas.openxmlformats.org/drawingml/2006/wordprocessingDrawing" xmlns:w10="urn:schemas-microsoft-com:office:word" xmlns:w="http://schemas.openxmlformats.org/wordprocessingml/2006/main" xmlns:w14="http://schemas.microsoft.com/office/word/2010/wordml" xmlns:w15="http://schemas.microsoft.com/office/word/2012/wordml" xmlns:w16cex="http://schemas.microsoft.com/office/word/2018/wordml/cex" xmlns:w16cid="http://schemas.microsoft.com/office/word/2016/wordml/cid" xmlns:w16="http://schemas.microsoft.com/office/word/2018/wordml" xmlns:w16du="http://schemas.microsoft.com/office/word/2023/wordml/word16du" xmlns:w16sdtdh="http://schemas.microsoft.com/office/word/2020/wordml/sdtdatahash" xmlns:w16sdtfl="http://schemas.microsoft.com/office/word/2024/wordml/sdtformatlock" xmlns:w16se="http://schemas.microsoft.com/office/word/2015/wordml/symex" xmlns:wpg="http://schemas.microsoft.com/office/word/2010/wordprocessingGroup" xmlns:wpi="http://schemas.microsoft.com/office/word/2010/wordprocessingInk" xmlns:wne="http://schemas.microsoft.com/office/word/2006/wordml" xmlns:wps="http://schemas.microsoft.com/office/word/2010/wordprocessingShape" mc:Ignorable="w14 w15 w16se w16cid w16 w16cex w16sdtdh w16sdtfl w16du wp14">
   <w:abstractNum w:abstractNumId="0" w15:restartNumberingAfterBreak="0">
+    <w:nsid w:val="1BCB7079"/>
+    <w:multiLevelType w:val="hybridMultilevel"/>
+    <w:tmpl w:val="3CCCBFD6"/>
+    <w:lvl w:ilvl="0" w:tplc="34090001">
+      <w:start w:val="1"/>
+      <w:numFmt w:val="bullet"/>
+      <w:lvlText w:val=""/>
+      <w:lvlJc w:val="left"/>
+      <w:pPr>
+        <w:ind w:left="1440" w:hanging="360"/>
+      </w:pPr>
+      <w:rPr>
+        <w:rFonts w:ascii="Symbol" w:hAnsi="Symbol" w:hint="default"/>
+      </w:rPr>
+    </w:lvl>
+    <w:lvl w:ilvl="1" w:tplc="34090003" w:tentative="1">
+      <w:start w:val="1"/>
+      <w:numFmt w:val="bullet"/>
+      <w:lvlText w:val="o"/>
+      <w:lvlJc w:val="left"/>
+      <w:pPr>
+        <w:ind w:left="2160" w:hanging="360"/>
+      </w:pPr>
+      <w:rPr>
+        <w:rFonts w:ascii="Courier New" w:hAnsi="Courier New" w:cs="Courier New" w:hint="default"/>
+      </w:rPr>
+    </w:lvl>
+    <w:lvl w:ilvl="2" w:tplc="34090005" w:tentative="1">
+      <w:start w:val="1"/>
+      <w:numFmt w:val="bullet"/>
+      <w:lvlText w:val=""/>
+      <w:lvlJc w:val="left"/>
+      <w:pPr>
+        <w:ind w:left="2880" w:hanging="360"/>
+      </w:pPr>
+      <w:rPr>
+        <w:rFonts w:ascii="Wingdings" w:hAnsi="Wingdings" w:hint="default"/>
+      </w:rPr>
+    </w:lvl>
+    <w:lvl w:ilvl="3" w:tplc="34090001" w:tentative="1">
+      <w:start w:val="1"/>
+      <w:numFmt w:val="bullet"/>
+      <w:lvlText w:val=""/>
+      <w:lvlJc w:val="left"/>
+      <w:pPr>
+        <w:ind w:left="3600" w:hanging="360"/>
+      </w:pPr>
+      <w:rPr>
+        <w:rFonts w:ascii="Symbol" w:hAnsi="Symbol" w:hint="default"/>
+      </w:rPr>
+    </w:lvl>
+    <w:lvl w:ilvl="4" w:tplc="34090003" w:tentative="1">
+      <w:start w:val="1"/>
+      <w:numFmt w:val="bullet"/>
+      <w:lvlText w:val="o"/>
+      <w:lvlJc w:val="left"/>
+      <w:pPr>
+        <w:ind w:left="4320" w:hanging="360"/>
+      </w:pPr>
+      <w:rPr>
+        <w:rFonts w:ascii="Courier New" w:hAnsi="Courier New" w:cs="Courier New" w:hint="default"/>
+      </w:rPr>
+    </w:lvl>
+    <w:lvl w:ilvl="5" w:tplc="34090005" w:tentative="1">
+      <w:start w:val="1"/>
+      <w:numFmt w:val="bullet"/>
+      <w:lvlText w:val=""/>
+      <w:lvlJc w:val="left"/>
+      <w:pPr>
+        <w:ind w:left="5040" w:hanging="360"/>
+      </w:pPr>
+      <w:rPr>
+        <w:rFonts w:ascii="Wingdings" w:hAnsi="Wingdings" w:hint="default"/>
+      </w:rPr>
+    </w:lvl>
+    <w:lvl w:ilvl="6" w:tplc="34090001" w:tentative="1">
+      <w:start w:val="1"/>
+      <w:numFmt w:val="bullet"/>
+      <w:lvlText w:val=""/>
+      <w:lvlJc w:val="left"/>
+      <w:pPr>
+        <w:ind w:left="5760" w:hanging="360"/>
+      </w:pPr>
+      <w:rPr>
+        <w:rFonts w:ascii="Symbol" w:hAnsi="Symbol" w:hint="default"/>
+      </w:rPr>
+    </w:lvl>
+    <w:lvl w:ilvl="7" w:tplc="34090003" w:tentative="1">
+      <w:start w:val="1"/>
+      <w:numFmt w:val="bullet"/>
+      <w:lvlText w:val="o"/>
+      <w:lvlJc w:val="left"/>
+      <w:pPr>
+        <w:ind w:left="6480" w:hanging="360"/>
+      </w:pPr>
+      <w:rPr>
+        <w:rFonts w:ascii="Courier New" w:hAnsi="Courier New" w:cs="Courier New" w:hint="default"/>
+      </w:rPr>
+    </w:lvl>
+    <w:lvl w:ilvl="8" w:tplc="34090005" w:tentative="1">
+      <w:start w:val="1"/>
+      <w:numFmt w:val="bullet"/>
+      <w:lvlText w:val=""/>
+      <w:lvlJc w:val="left"/>
+      <w:pPr>
+        <w:ind w:left="7200" w:hanging="360"/>
+      </w:pPr>
+      <w:rPr>
+        <w:rFonts w:ascii="Wingdings" w:hAnsi="Wingdings" w:hint="default"/>
+      </w:rPr>
+    </w:lvl>
+  </w:abstractNum>
+  <w:abstractNum w:abstractNumId="1" w15:restartNumberingAfterBreak="0">
     <w:nsid w:val="212817A1"/>
     <w:multiLevelType w:val="hybridMultilevel"/>
     <w:tmpl w:val="7610C73A"/>
@@ -1210,7 +1971,7 @@
       </w:rPr>
     </w:lvl>
   </w:abstractNum>
-  <w:abstractNum w:abstractNumId="1" w15:restartNumberingAfterBreak="0">
+  <w:abstractNum w:abstractNumId="2" w15:restartNumberingAfterBreak="0">
     <w:nsid w:val="2DD86898"/>
     <w:multiLevelType w:val="hybridMultilevel"/>
     <w:tmpl w:val="C186DBC8"/>
@@ -1300,7 +2061,7 @@
       </w:pPr>
     </w:lvl>
   </w:abstractNum>
-  <w:abstractNum w:abstractNumId="2" w15:restartNumberingAfterBreak="0">
+  <w:abstractNum w:abstractNumId="3" w15:restartNumberingAfterBreak="0">
     <w:nsid w:val="613449DC"/>
     <w:multiLevelType w:val="hybridMultilevel"/>
     <w:tmpl w:val="425C35CC"/>
@@ -1416,12 +2177,15 @@
     </w:lvl>
   </w:abstractNum>
   <w:num w:numId="1" w16cid:durableId="1851144871">
+    <w:abstractNumId w:val="2"/>
+  </w:num>
+  <w:num w:numId="2" w16cid:durableId="1309479458">
+    <w:abstractNumId w:val="3"/>
+  </w:num>
+  <w:num w:numId="3" w16cid:durableId="185560908">
     <w:abstractNumId w:val="1"/>
   </w:num>
-  <w:num w:numId="2" w16cid:durableId="1309479458">
-    <w:abstractNumId w:val="2"/>
-  </w:num>
-  <w:num w:numId="3" w16cid:durableId="185560908">
+  <w:num w:numId="4" w16cid:durableId="1150947152">
     <w:abstractNumId w:val="0"/>
   </w:num>
 </w:numbering>
@@ -2544,6 +3308,42 @@
       <w14:ligatures w14:val="none"/>
     </w:rPr>
   </w:style>
+  <w:style w:type="paragraph" w:styleId="TOC1">
+    <w:name w:val="toc 1"/>
+    <w:basedOn w:val="Normal"/>
+    <w:next w:val="Normal"/>
+    <w:autoRedefine/>
+    <w:uiPriority w:val="39"/>
+    <w:unhideWhenUsed/>
+    <w:rsid w:val="00891AED"/>
+    <w:pPr>
+      <w:spacing w:after="100"/>
+    </w:pPr>
+  </w:style>
+  <w:style w:type="paragraph" w:styleId="TOC2">
+    <w:name w:val="toc 2"/>
+    <w:basedOn w:val="Normal"/>
+    <w:next w:val="Normal"/>
+    <w:autoRedefine/>
+    <w:uiPriority w:val="39"/>
+    <w:unhideWhenUsed/>
+    <w:rsid w:val="00891AED"/>
+    <w:pPr>
+      <w:spacing w:after="100"/>
+      <w:ind w:left="240"/>
+    </w:pPr>
+  </w:style>
+  <w:style w:type="character" w:styleId="Hyperlink">
+    <w:name w:val="Hyperlink"/>
+    <w:basedOn w:val="DefaultParagraphFont"/>
+    <w:uiPriority w:val="99"/>
+    <w:unhideWhenUsed/>
+    <w:rsid w:val="00891AED"/>
+    <w:rPr>
+      <w:color w:val="467886" w:themeColor="hyperlink"/>
+      <w:u w:val="single"/>
+    </w:rPr>
+  </w:style>
 </w:styles>
 </file>
 

</xml_diff>

<commit_message>
Minor revisions to game docu.
</commit_message>
<xml_diff>
--- a/docu_gamedocumentation/main_draft.docx
+++ b/docu_gamedocumentation/main_draft.docx
@@ -7,13 +7,8 @@
         <w:pStyle w:val="Title"/>
       </w:pPr>
       <w:bookmarkStart w:id="0" w:name="_Hlk214714423"/>
-      <w:proofErr w:type="spellStart"/>
-      <w:r>
-        <w:t>SandEE</w:t>
-      </w:r>
-      <w:proofErr w:type="spellEnd"/>
-      <w:r>
-        <w:t xml:space="preserve">: AN EDUCATIONAL MULTI-PLATFORM 2D OPEN WORLD SURVIVAL CRAFTING GAME FOR LUA AND PYTHON FOR ICT AND STEM STUDENTS OF YVERDON DE PESTALLOZI SCHOOL INC.      </w:t>
+      <w:r>
+        <w:t xml:space="preserve">SandEE: AN EDUCATIONAL MULTI-PLATFORM 2D OPEN WORLD SURVIVAL CRAFTING GAME FOR LUA AND PYTHON FOR ICT AND STEM STUDENTS OF YVERDON DE PESTALLOZI SCHOOL INC.      </w:t>
       </w:r>
       <w:bookmarkEnd w:id="0"/>
     </w:p>
@@ -475,13 +470,8 @@
       <w:bookmarkEnd w:id="1"/>
     </w:p>
     <w:p>
-      <w:proofErr w:type="spellStart"/>
-      <w:r>
-        <w:t>SandEE</w:t>
-      </w:r>
-      <w:proofErr w:type="spellEnd"/>
-      <w:r>
-        <w:t xml:space="preserve"> is a video game designed as a supplementary learning game. The game is designed primarily to be played single player with a leaderboard system to encourage progress among players.</w:t>
+      <w:r>
+        <w:t>SandEE is a video game designed as a supplementary learning game. The game is designed primarily to be played single player with a leaderboard system to encourage progress among players.</w:t>
       </w:r>
     </w:p>
     <w:p>
@@ -528,7 +518,6 @@
           <w:color w:val="auto"/>
         </w:rPr>
       </w:pPr>
-      <w:proofErr w:type="spellStart"/>
       <w:r>
         <w:rPr>
           <w:rStyle w:val="SubtleEmphasis"/>
@@ -538,7 +527,6 @@
         </w:rPr>
         <w:t>Hotbar</w:t>
       </w:r>
-      <w:proofErr w:type="spellEnd"/>
     </w:p>
     <w:p>
       <w:pPr>
@@ -555,25 +543,7 @@
           <w:i w:val="0"/>
           <w:iCs w:val="0"/>
         </w:rPr>
-        <w:t xml:space="preserve">The </w:t>
-      </w:r>
-      <w:proofErr w:type="spellStart"/>
-      <w:r>
-        <w:rPr>
-          <w:rStyle w:val="SubtleEmphasis"/>
-          <w:i w:val="0"/>
-          <w:iCs w:val="0"/>
-        </w:rPr>
-        <w:t>hotbar</w:t>
-      </w:r>
-      <w:proofErr w:type="spellEnd"/>
-      <w:r>
-        <w:rPr>
-          <w:rStyle w:val="SubtleEmphasis"/>
-          <w:i w:val="0"/>
-          <w:iCs w:val="0"/>
-        </w:rPr>
-        <w:t xml:space="preserve"> indicates what item is currently selected for the player to use</w:t>
+        <w:t>The hotbar indicates what item is currently selected for the player to use</w:t>
       </w:r>
       <w:r>
         <w:rPr>
@@ -665,25 +635,7 @@
           <w:i w:val="0"/>
           <w:iCs w:val="0"/>
         </w:rPr>
-        <w:t xml:space="preserve"> use for crafting and </w:t>
-      </w:r>
-      <w:proofErr w:type="spellStart"/>
-      <w:r>
-        <w:rPr>
-          <w:rStyle w:val="SubtleEmphasis"/>
-          <w:i w:val="0"/>
-          <w:iCs w:val="0"/>
-        </w:rPr>
-        <w:t>hotbar</w:t>
-      </w:r>
-      <w:proofErr w:type="spellEnd"/>
-      <w:r>
-        <w:rPr>
-          <w:rStyle w:val="SubtleEmphasis"/>
-          <w:i w:val="0"/>
-          <w:iCs w:val="0"/>
-        </w:rPr>
-        <w:t xml:space="preserve"> usage.</w:t>
+        <w:t xml:space="preserve"> use for crafting and hotbar usage.</w:t>
       </w:r>
     </w:p>
     <w:p>
@@ -889,7 +841,7 @@
         <w:pStyle w:val="IndentNormal-Level2"/>
       </w:pPr>
       <w:r>
-        <w:t>This area is interactable by the player and servers as a dedicated source of water.</w:t>
+        <w:t>This area is interactable by the player and serves as a dedicated source of water.</w:t>
       </w:r>
     </w:p>
     <w:p>
@@ -1018,7 +970,7 @@
         <w:t>The challenge areas serve as a progression for the player to verify their learning regarding Lua and Python. The entrance to these challenge areas</w:t>
       </w:r>
       <w:r>
-        <w:t>.</w:t>
+        <w:t xml:space="preserve"> will appear as the player progresses through the missions.</w:t>
       </w:r>
     </w:p>
     <w:p>
@@ -1044,214 +996,203 @@
           <w:iCs w:val="0"/>
           <w:color w:val="auto"/>
         </w:rPr>
+        <w:t>Core Gameplay Mechanics</w:t>
+      </w:r>
+      <w:bookmarkEnd w:id="4"/>
+    </w:p>
+    <w:p>
+      <w:pPr>
+        <w:pStyle w:val="ListParagraph"/>
+      </w:pPr>
+      <w:r>
+        <w:t>Procedural Map Generation</w:t>
+      </w:r>
+    </w:p>
+    <w:p>
+      <w:pPr>
+        <w:pStyle w:val="IndentNormal"/>
+      </w:pPr>
+      <w:r>
+        <w:t>The map will be randomly generated by a random seed at the start of a new game.</w:t>
+      </w:r>
+    </w:p>
+    <w:p>
+      <w:pPr>
+        <w:pStyle w:val="ListParagraph"/>
+      </w:pPr>
+      <w:r>
+        <w:t>Procedural Structure Generation</w:t>
+      </w:r>
+    </w:p>
+    <w:p>
+      <w:pPr>
+        <w:pStyle w:val="IndentNormal"/>
+      </w:pPr>
+      <w:r>
+        <w:t>The structures and interactable objects are also generated on top of the randomly generated maps.</w:t>
+      </w:r>
+    </w:p>
+    <w:p>
+      <w:pPr>
+        <w:pStyle w:val="ListParagraph"/>
+      </w:pPr>
+      <w:r>
+        <w:t>Autosaving</w:t>
+      </w:r>
+    </w:p>
+    <w:p>
+      <w:pPr>
+        <w:pStyle w:val="IndentNormal"/>
+      </w:pPr>
+      <w:r>
+        <w:t>The game autosaves at crucical moments and periodically.</w:t>
+      </w:r>
+    </w:p>
+    <w:p>
+      <w:pPr>
+        <w:pStyle w:val="ListParagraph"/>
+      </w:pPr>
+      <w:r>
+        <w:t>Automatica</w:t>
+      </w:r>
+    </w:p>
+    <w:p>
+      <w:pPr>
+        <w:pStyle w:val="IndentNormal"/>
+      </w:pPr>
+      <w:r>
+        <w:t>Robot-like craftables that allow the user to automate certain processes by programming it through Lua, unlockable through the Lua-focused challenge areas.</w:t>
+      </w:r>
+    </w:p>
+    <w:p>
+      <w:pPr>
+        <w:pStyle w:val="IndentNormal"/>
+      </w:pPr>
+      <w:r>
+        <w:t>Automaticas can be used to automate interaction with objects and aid the player in combat.</w:t>
+      </w:r>
+    </w:p>
+    <w:p>
+      <w:pPr>
+        <w:pStyle w:val="ListParagraph"/>
+      </w:pPr>
+      <w:r>
+        <w:t>Algorithmica</w:t>
+      </w:r>
+    </w:p>
+    <w:p>
+      <w:pPr>
+        <w:pStyle w:val="IndentNormal"/>
+      </w:pPr>
+      <w:r>
+        <w:t>Allows the user to imbue regular items with automation by programming it through Python, unlockable through the Python-focused challenge areas.</w:t>
+      </w:r>
+    </w:p>
+    <w:p>
+      <w:pPr>
+        <w:pStyle w:val="ListParagraph"/>
+      </w:pPr>
+      <w:r>
+        <w:t>Missions</w:t>
+      </w:r>
+    </w:p>
+    <w:p>
+      <w:pPr>
+        <w:pStyle w:val="IndentNormal"/>
+      </w:pPr>
+      <w:r>
+        <w:t xml:space="preserve">Missons will be listed and given automatically to the player. As the player progresses the difficulty of the missions will scale accordingly. </w:t>
+      </w:r>
+    </w:p>
+    <w:p>
+      <w:pPr>
+        <w:pStyle w:val="IndentNormal"/>
+      </w:pPr>
+      <w:r>
+        <w:t xml:space="preserve">Missions are based on the </w:t>
+      </w:r>
+      <w:r>
+        <w:t>literature of the current version of Lua and Python binaries specified on the version of the game.</w:t>
+      </w:r>
+    </w:p>
+    <w:p>
+      <w:pPr>
+        <w:pStyle w:val="ListParagraph"/>
+      </w:pPr>
+      <w:r>
+        <w:t>Ranks</w:t>
+      </w:r>
+    </w:p>
+    <w:p>
+      <w:pPr>
+        <w:pStyle w:val="IndentNormal"/>
+      </w:pPr>
+      <w:r>
+        <w:t>Ranks can be raised by completing missions according</w:t>
+      </w:r>
+      <w:r>
+        <w:t>ly. T</w:t>
+      </w:r>
+      <w:r>
+        <w:t>he player’s ranks will be tied to their accounts and will be displayed in the game leaderboards for the players to compare their progress in-game.</w:t>
+      </w:r>
+    </w:p>
+    <w:p>
+      <w:pPr>
+        <w:pStyle w:val="ListParagraph"/>
+      </w:pPr>
+      <w:r>
+        <w:t>In-Game Compiler</w:t>
+      </w:r>
+    </w:p>
+    <w:p>
+      <w:pPr>
+        <w:pStyle w:val="IndentNormal"/>
+      </w:pPr>
+      <w:r>
+        <w:t>The game features a code editor panel for in game code compiling for the player to test their input codes.</w:t>
+      </w:r>
+    </w:p>
+    <w:p>
+      <w:pPr>
+        <w:pStyle w:val="PL-Level2"/>
+      </w:pPr>
+      <w:r>
+        <w:t>Lua</w:t>
+      </w:r>
+    </w:p>
+    <w:p>
+      <w:pPr>
+        <w:pStyle w:val="IndentNormal-Level2"/>
+      </w:pPr>
+      <w:r>
+        <w:t xml:space="preserve">Lua programming language is used for programming </w:t>
+      </w:r>
+      <w:r>
+        <w:t>Automatica</w:t>
+      </w:r>
+      <w:r>
+        <w:t xml:space="preserve"> within the game.</w:t>
+      </w:r>
+    </w:p>
+    <w:p>
+      <w:pPr>
+        <w:pStyle w:val="PL-Level2"/>
+      </w:pPr>
+      <w:r>
+        <w:t>Python</w:t>
+      </w:r>
+    </w:p>
+    <w:p>
+      <w:pPr>
+        <w:pStyle w:val="IndentNormal-Level2"/>
+      </w:pPr>
+      <w:r>
         <w:lastRenderedPageBreak/>
-        <w:t>Core Gameplay Mechanics</w:t>
-      </w:r>
-      <w:bookmarkEnd w:id="4"/>
-    </w:p>
-    <w:p>
-      <w:pPr>
-        <w:pStyle w:val="ListParagraph"/>
-      </w:pPr>
-      <w:r>
-        <w:t>Procedural Map Generation</w:t>
-      </w:r>
-    </w:p>
-    <w:p>
-      <w:pPr>
-        <w:pStyle w:val="IndentNormal"/>
-      </w:pPr>
-      <w:r>
-        <w:t>The map will be randomly generated by a random seed generate at the start of a new game.</w:t>
-      </w:r>
-    </w:p>
-    <w:p>
-      <w:pPr>
-        <w:pStyle w:val="ListParagraph"/>
-      </w:pPr>
-      <w:r>
-        <w:t>Procedural Structure Generation</w:t>
-      </w:r>
-    </w:p>
-    <w:p>
-      <w:pPr>
-        <w:pStyle w:val="IndentNormal"/>
-      </w:pPr>
-      <w:r>
-        <w:t>The structures and interactable objects are also generated on top of the randomly generated maps.</w:t>
-      </w:r>
-    </w:p>
-    <w:p>
-      <w:pPr>
-        <w:pStyle w:val="ListParagraph"/>
-      </w:pPr>
-      <w:proofErr w:type="spellStart"/>
-      <w:r>
-        <w:t>Automatica</w:t>
-      </w:r>
-      <w:proofErr w:type="spellEnd"/>
-    </w:p>
-    <w:p>
-      <w:pPr>
-        <w:pStyle w:val="IndentNormal"/>
-      </w:pPr>
-      <w:r>
-        <w:t xml:space="preserve">Robot-like </w:t>
-      </w:r>
-      <w:proofErr w:type="spellStart"/>
-      <w:r>
-        <w:t>craftables</w:t>
-      </w:r>
-      <w:proofErr w:type="spellEnd"/>
-      <w:r>
-        <w:t xml:space="preserve"> that allow the user to automate certain processes by programming it through Lua, unlockable through the Lua-focused challenge areas.</w:t>
-      </w:r>
-    </w:p>
-    <w:p>
-      <w:pPr>
-        <w:pStyle w:val="IndentNormal"/>
-      </w:pPr>
-      <w:proofErr w:type="spellStart"/>
-      <w:r>
-        <w:t>Automaticas</w:t>
-      </w:r>
-      <w:proofErr w:type="spellEnd"/>
-      <w:r>
-        <w:t xml:space="preserve"> can be used to automate interaction with objects and aid the player in combat.</w:t>
-      </w:r>
-    </w:p>
-    <w:p>
-      <w:pPr>
-        <w:pStyle w:val="ListParagraph"/>
-      </w:pPr>
-      <w:proofErr w:type="spellStart"/>
-      <w:r>
-        <w:t>Algorithmica</w:t>
-      </w:r>
-      <w:proofErr w:type="spellEnd"/>
-    </w:p>
-    <w:p>
-      <w:pPr>
-        <w:pStyle w:val="IndentNormal"/>
-      </w:pPr>
-      <w:r>
-        <w:t>Allows the user to imbue regular items with automation by programming it through Python, unlockable through the Python-focused challenge areas.</w:t>
-      </w:r>
-    </w:p>
-    <w:p>
-      <w:pPr>
-        <w:pStyle w:val="ListParagraph"/>
-      </w:pPr>
-      <w:r>
-        <w:t>Missions</w:t>
-      </w:r>
-    </w:p>
-    <w:p>
-      <w:pPr>
-        <w:pStyle w:val="IndentNormal"/>
-      </w:pPr>
-      <w:r>
-        <w:t xml:space="preserve">Missons will be listed and given automatically to the player. As the player progresses the difficulty of the missions will scale accordingly. </w:t>
-      </w:r>
-    </w:p>
-    <w:p>
-      <w:pPr>
-        <w:pStyle w:val="IndentNormal"/>
-      </w:pPr>
-      <w:r>
-        <w:t xml:space="preserve">Missions are based on the </w:t>
-      </w:r>
-      <w:r>
-        <w:t>literature of the current version of Lua and Python binaries specified on the version of the game.</w:t>
-      </w:r>
-    </w:p>
-    <w:p>
-      <w:pPr>
-        <w:pStyle w:val="ListParagraph"/>
-      </w:pPr>
-      <w:r>
-        <w:t>Ranks</w:t>
-      </w:r>
-    </w:p>
-    <w:p>
-      <w:pPr>
-        <w:pStyle w:val="IndentNormal"/>
-      </w:pPr>
-      <w:r>
-        <w:t>Ranks can be raised by completing missions according</w:t>
-      </w:r>
-      <w:r>
-        <w:t>ly. T</w:t>
-      </w:r>
-      <w:r>
-        <w:t>he player’s ranks will be tied to their accounts and will be displayed in the game leaderboards for the players to compare their progress in-game.</w:t>
-      </w:r>
-    </w:p>
-    <w:p>
-      <w:pPr>
-        <w:pStyle w:val="ListParagraph"/>
-      </w:pPr>
-      <w:r>
-        <w:t>In-Game Compiler</w:t>
-      </w:r>
-    </w:p>
-    <w:p>
-      <w:pPr>
-        <w:pStyle w:val="IndentNormal"/>
-      </w:pPr>
-      <w:r>
-        <w:t>The game features a code editor panel for in game code compiling for the player to test their input codes.</w:t>
-      </w:r>
-    </w:p>
-    <w:p>
-      <w:pPr>
-        <w:pStyle w:val="PL-Level2"/>
-      </w:pPr>
-      <w:r>
-        <w:t>Lua</w:t>
-      </w:r>
-    </w:p>
-    <w:p>
-      <w:pPr>
-        <w:pStyle w:val="IndentNormal-Level2"/>
-      </w:pPr>
-      <w:r>
-        <w:t xml:space="preserve">Lua programming language is used for programming </w:t>
-      </w:r>
-      <w:proofErr w:type="spellStart"/>
-      <w:r>
-        <w:t>Automatica</w:t>
-      </w:r>
-      <w:proofErr w:type="spellEnd"/>
-      <w:r>
-        <w:t xml:space="preserve"> within the game.</w:t>
-      </w:r>
-    </w:p>
-    <w:p>
-      <w:pPr>
-        <w:pStyle w:val="PL-Level2"/>
-      </w:pPr>
-      <w:r>
-        <w:t>Python</w:t>
-      </w:r>
-    </w:p>
-    <w:p>
-      <w:pPr>
-        <w:pStyle w:val="IndentNormal-Level2"/>
-      </w:pPr>
-      <w:r>
         <w:t>Python programming language is used for programming automat</w:t>
       </w:r>
       <w:r>
-        <w:t xml:space="preserve">ion for </w:t>
-      </w:r>
-      <w:proofErr w:type="spellStart"/>
-      <w:r>
-        <w:t>Algorithmica</w:t>
-      </w:r>
-      <w:proofErr w:type="spellEnd"/>
-      <w:r>
-        <w:t xml:space="preserve"> within the game.</w:t>
+        <w:t>ion for Algorithmica within the game.</w:t>
       </w:r>
     </w:p>
     <w:p>
@@ -1372,39 +1313,7 @@
         <w:pStyle w:val="IndentNormal"/>
       </w:pPr>
       <w:r>
-        <w:t xml:space="preserve">Progression can be measured by coding knowledge of the player, the more coding he can do the more utility he can add to the </w:t>
-      </w:r>
-      <w:proofErr w:type="spellStart"/>
-      <w:r>
-        <w:t>Automatica</w:t>
-      </w:r>
-      <w:proofErr w:type="spellEnd"/>
-      <w:r>
-        <w:t xml:space="preserve"> and </w:t>
-      </w:r>
-      <w:proofErr w:type="spellStart"/>
-      <w:r>
-        <w:t>Algorithmica</w:t>
-      </w:r>
-      <w:proofErr w:type="spellEnd"/>
-      <w:r>
-        <w:t xml:space="preserve">. Adding code to </w:t>
-      </w:r>
-      <w:proofErr w:type="spellStart"/>
-      <w:r>
-        <w:t>automatica</w:t>
-      </w:r>
-      <w:proofErr w:type="spellEnd"/>
-      <w:r>
-        <w:t xml:space="preserve"> allows it to be automated and adding code to </w:t>
-      </w:r>
-      <w:proofErr w:type="spellStart"/>
-      <w:r>
-        <w:t>Algorithmica</w:t>
-      </w:r>
-      <w:proofErr w:type="spellEnd"/>
-      <w:r>
-        <w:t xml:space="preserve"> allows items to have more damage and inflict additional effects.</w:t>
+        <w:t>Progression can be measured by coding knowledge of the player, the more coding he can do the more utility he can add to the Automatica and Algorithmica. Adding code to automatica allows it to be automated and adding code to Algorithmica allows items to have more damage and inflict additional effects.</w:t>
       </w:r>
     </w:p>
     <w:p>
@@ -1448,7 +1357,10 @@
         <w:pStyle w:val="ListParagraph"/>
       </w:pPr>
       <w:r>
-        <w:t xml:space="preserve">Players add utility by coding </w:t>
+        <w:t>Players add utility by coding</w:t>
+      </w:r>
+      <w:r>
+        <w:t>.</w:t>
       </w:r>
     </w:p>
     <w:p>

</xml_diff>

<commit_message>
Weekly Consultation Files Update
Updated Consultation Files upto week 3.
</commit_message>
<xml_diff>
--- a/docu_gamedocumentation/main_draft.docx
+++ b/docu_gamedocumentation/main_draft.docx
@@ -7,8 +7,13 @@
         <w:pStyle w:val="Title"/>
       </w:pPr>
       <w:bookmarkStart w:id="0" w:name="_Hlk214714423"/>
-      <w:r>
-        <w:t xml:space="preserve">SandEE: AN EDUCATIONAL MULTI-PLATFORM 2D OPEN WORLD SURVIVAL CRAFTING GAME FOR LUA AND PYTHON FOR ICT AND STEM STUDENTS OF YVERDON DE PESTALLOZI SCHOOL INC.      </w:t>
+      <w:proofErr w:type="spellStart"/>
+      <w:r>
+        <w:t>SandEE</w:t>
+      </w:r>
+      <w:proofErr w:type="spellEnd"/>
+      <w:r>
+        <w:t xml:space="preserve">: AN EDUCATIONAL MULTI-PLATFORM 2D OPEN WORLD SURVIVAL CRAFTING GAME FOR LUA AND PYTHON FOR ICT AND STEM STUDENTS OF YVERDON DE PESTALLOZI SCHOOL INC.      </w:t>
       </w:r>
       <w:bookmarkEnd w:id="0"/>
     </w:p>
@@ -75,10 +80,12 @@
           <w:pPr>
             <w:pStyle w:val="TOC1"/>
             <w:tabs>
-              <w:tab w:val="right" w:leader="dot" w:pos="9350"/>
+              <w:tab w:val="right" w:leader="dot" w:pos="9016"/>
             </w:tabs>
             <w:rPr>
+              <w:rFonts w:asciiTheme="minorHAnsi" w:eastAsiaTheme="minorEastAsia" w:hAnsiTheme="minorHAnsi"/>
               <w:noProof/>
+              <w:lang w:eastAsia="en-PH"/>
             </w:rPr>
           </w:pPr>
           <w:r>
@@ -90,7 +97,7 @@
           <w:r>
             <w:fldChar w:fldCharType="separate"/>
           </w:r>
-          <w:hyperlink w:anchor="_Toc220391704" w:history="1">
+          <w:hyperlink w:anchor="_Toc220405942" w:history="1">
             <w:r>
               <w:rPr>
                 <w:rStyle w:val="Hyperlink"/>
@@ -117,7 +124,7 @@
                 <w:noProof/>
                 <w:webHidden/>
               </w:rPr>
-              <w:instrText xml:space="preserve"> PAGEREF _Toc220391704 \h </w:instrText>
+              <w:instrText xml:space="preserve"> PAGEREF _Toc220405942 \h </w:instrText>
             </w:r>
             <w:r>
               <w:rPr>
@@ -152,13 +159,15 @@
           <w:pPr>
             <w:pStyle w:val="TOC2"/>
             <w:tabs>
-              <w:tab w:val="right" w:leader="dot" w:pos="9350"/>
+              <w:tab w:val="right" w:leader="dot" w:pos="9016"/>
             </w:tabs>
             <w:rPr>
+              <w:rFonts w:asciiTheme="minorHAnsi" w:eastAsiaTheme="minorEastAsia" w:hAnsiTheme="minorHAnsi"/>
               <w:noProof/>
+              <w:lang w:eastAsia="en-PH"/>
             </w:rPr>
           </w:pPr>
-          <w:hyperlink w:anchor="_Toc220391705" w:history="1">
+          <w:hyperlink w:anchor="_Toc220405943" w:history="1">
             <w:r>
               <w:rPr>
                 <w:rStyle w:val="Hyperlink"/>
@@ -185,7 +194,7 @@
                 <w:noProof/>
                 <w:webHidden/>
               </w:rPr>
-              <w:instrText xml:space="preserve"> PAGEREF _Toc220391705 \h </w:instrText>
+              <w:instrText xml:space="preserve"> PAGEREF _Toc220405943 \h </w:instrText>
             </w:r>
             <w:r>
               <w:rPr>
@@ -220,13 +229,15 @@
           <w:pPr>
             <w:pStyle w:val="TOC2"/>
             <w:tabs>
-              <w:tab w:val="right" w:leader="dot" w:pos="9350"/>
+              <w:tab w:val="right" w:leader="dot" w:pos="9016"/>
             </w:tabs>
             <w:rPr>
+              <w:rFonts w:asciiTheme="minorHAnsi" w:eastAsiaTheme="minorEastAsia" w:hAnsiTheme="minorHAnsi"/>
               <w:noProof/>
+              <w:lang w:eastAsia="en-PH"/>
             </w:rPr>
           </w:pPr>
-          <w:hyperlink w:anchor="_Toc220391706" w:history="1">
+          <w:hyperlink w:anchor="_Toc220405944" w:history="1">
             <w:r>
               <w:rPr>
                 <w:rStyle w:val="Hyperlink"/>
@@ -253,7 +264,7 @@
                 <w:noProof/>
                 <w:webHidden/>
               </w:rPr>
-              <w:instrText xml:space="preserve"> PAGEREF _Toc220391706 \h </w:instrText>
+              <w:instrText xml:space="preserve"> PAGEREF _Toc220405944 \h </w:instrText>
             </w:r>
             <w:r>
               <w:rPr>
@@ -288,13 +299,15 @@
           <w:pPr>
             <w:pStyle w:val="TOC1"/>
             <w:tabs>
-              <w:tab w:val="right" w:leader="dot" w:pos="9350"/>
+              <w:tab w:val="right" w:leader="dot" w:pos="9016"/>
             </w:tabs>
             <w:rPr>
+              <w:rFonts w:asciiTheme="minorHAnsi" w:eastAsiaTheme="minorEastAsia" w:hAnsiTheme="minorHAnsi"/>
               <w:noProof/>
+              <w:lang w:eastAsia="en-PH"/>
             </w:rPr>
           </w:pPr>
-          <w:hyperlink w:anchor="_Toc220391707" w:history="1">
+          <w:hyperlink w:anchor="_Toc220405945" w:history="1">
             <w:r>
               <w:rPr>
                 <w:rStyle w:val="Hyperlink"/>
@@ -321,7 +334,7 @@
                 <w:noProof/>
                 <w:webHidden/>
               </w:rPr>
-              <w:instrText xml:space="preserve"> PAGEREF _Toc220391707 \h </w:instrText>
+              <w:instrText xml:space="preserve"> PAGEREF _Toc220405945 \h </w:instrText>
             </w:r>
             <w:r>
               <w:rPr>
@@ -356,13 +369,15 @@
           <w:pPr>
             <w:pStyle w:val="TOC1"/>
             <w:tabs>
-              <w:tab w:val="right" w:leader="dot" w:pos="9350"/>
+              <w:tab w:val="right" w:leader="dot" w:pos="9016"/>
             </w:tabs>
             <w:rPr>
+              <w:rFonts w:asciiTheme="minorHAnsi" w:eastAsiaTheme="minorEastAsia" w:hAnsiTheme="minorHAnsi"/>
               <w:noProof/>
+              <w:lang w:eastAsia="en-PH"/>
             </w:rPr>
           </w:pPr>
-          <w:hyperlink w:anchor="_Toc220391708" w:history="1">
+          <w:hyperlink w:anchor="_Toc220405946" w:history="1">
             <w:r>
               <w:rPr>
                 <w:rStyle w:val="Hyperlink"/>
@@ -389,7 +404,7 @@
                 <w:noProof/>
                 <w:webHidden/>
               </w:rPr>
-              <w:instrText xml:space="preserve"> PAGEREF _Toc220391708 \h </w:instrText>
+              <w:instrText xml:space="preserve"> PAGEREF _Toc220405946 \h </w:instrText>
             </w:r>
             <w:r>
               <w:rPr>
@@ -410,6 +425,76 @@
                 <w:webHidden/>
               </w:rPr>
               <w:t>7</w:t>
+            </w:r>
+            <w:r>
+              <w:rPr>
+                <w:noProof/>
+                <w:webHidden/>
+              </w:rPr>
+              <w:fldChar w:fldCharType="end"/>
+            </w:r>
+          </w:hyperlink>
+        </w:p>
+        <w:p>
+          <w:pPr>
+            <w:pStyle w:val="TOC1"/>
+            <w:tabs>
+              <w:tab w:val="right" w:leader="dot" w:pos="9016"/>
+            </w:tabs>
+            <w:rPr>
+              <w:rFonts w:asciiTheme="minorHAnsi" w:eastAsiaTheme="minorEastAsia" w:hAnsiTheme="minorHAnsi"/>
+              <w:noProof/>
+              <w:lang w:eastAsia="en-PH"/>
+            </w:rPr>
+          </w:pPr>
+          <w:hyperlink w:anchor="_Toc220405947" w:history="1">
+            <w:r>
+              <w:rPr>
+                <w:rStyle w:val="Hyperlink"/>
+                <w:noProof/>
+              </w:rPr>
+              <w:t>Storyboard</w:t>
+            </w:r>
+            <w:r>
+              <w:rPr>
+                <w:noProof/>
+                <w:webHidden/>
+              </w:rPr>
+              <w:tab/>
+            </w:r>
+            <w:r>
+              <w:rPr>
+                <w:noProof/>
+                <w:webHidden/>
+              </w:rPr>
+              <w:fldChar w:fldCharType="begin"/>
+            </w:r>
+            <w:r>
+              <w:rPr>
+                <w:noProof/>
+                <w:webHidden/>
+              </w:rPr>
+              <w:instrText xml:space="preserve"> PAGEREF _Toc220405947 \h </w:instrText>
+            </w:r>
+            <w:r>
+              <w:rPr>
+                <w:noProof/>
+                <w:webHidden/>
+              </w:rPr>
+            </w:r>
+            <w:r>
+              <w:rPr>
+                <w:noProof/>
+                <w:webHidden/>
+              </w:rPr>
+              <w:fldChar w:fldCharType="separate"/>
+            </w:r>
+            <w:r>
+              <w:rPr>
+                <w:noProof/>
+                <w:webHidden/>
+              </w:rPr>
+              <w:t>8</w:t>
             </w:r>
             <w:r>
               <w:rPr>
@@ -462,7 +547,7 @@
       <w:pPr>
         <w:pStyle w:val="Heading1"/>
       </w:pPr>
-      <w:bookmarkStart w:id="1" w:name="_Toc220391704"/>
+      <w:bookmarkStart w:id="1" w:name="_Toc220405942"/>
       <w:r>
         <w:lastRenderedPageBreak/>
         <w:t>Scope</w:t>
@@ -470,8 +555,13 @@
       <w:bookmarkEnd w:id="1"/>
     </w:p>
     <w:p>
-      <w:r>
-        <w:t>SandEE is a video game designed as a supplementary learning game. The game is designed primarily to be played single player with a leaderboard system to encourage progress among players.</w:t>
+      <w:proofErr w:type="spellStart"/>
+      <w:r>
+        <w:t>SandEE</w:t>
+      </w:r>
+      <w:proofErr w:type="spellEnd"/>
+      <w:r>
+        <w:t xml:space="preserve"> is a video game designed as a supplementary learning game. The game is designed primarily to be played single player with a leaderboard system to encourage progress among players.</w:t>
       </w:r>
     </w:p>
     <w:p>
@@ -483,7 +573,7 @@
       <w:pPr>
         <w:pStyle w:val="Heading2"/>
       </w:pPr>
-      <w:bookmarkStart w:id="2" w:name="_Toc220391705"/>
+      <w:bookmarkStart w:id="2" w:name="_Toc220405943"/>
       <w:r>
         <w:t>User Interface</w:t>
       </w:r>
@@ -518,6 +608,7 @@
           <w:color w:val="auto"/>
         </w:rPr>
       </w:pPr>
+      <w:proofErr w:type="spellStart"/>
       <w:r>
         <w:rPr>
           <w:rStyle w:val="SubtleEmphasis"/>
@@ -527,6 +618,7 @@
         </w:rPr>
         <w:t>Hotbar</w:t>
       </w:r>
+      <w:proofErr w:type="spellEnd"/>
     </w:p>
     <w:p>
       <w:pPr>
@@ -543,7 +635,25 @@
           <w:i w:val="0"/>
           <w:iCs w:val="0"/>
         </w:rPr>
-        <w:t>The hotbar indicates what item is currently selected for the player to use</w:t>
+        <w:t xml:space="preserve">The </w:t>
+      </w:r>
+      <w:proofErr w:type="spellStart"/>
+      <w:r>
+        <w:rPr>
+          <w:rStyle w:val="SubtleEmphasis"/>
+          <w:i w:val="0"/>
+          <w:iCs w:val="0"/>
+        </w:rPr>
+        <w:t>hotbar</w:t>
+      </w:r>
+      <w:proofErr w:type="spellEnd"/>
+      <w:r>
+        <w:rPr>
+          <w:rStyle w:val="SubtleEmphasis"/>
+          <w:i w:val="0"/>
+          <w:iCs w:val="0"/>
+        </w:rPr>
+        <w:t xml:space="preserve"> indicates what item is currently selected for the player to use</w:t>
       </w:r>
       <w:r>
         <w:rPr>
@@ -635,7 +745,25 @@
           <w:i w:val="0"/>
           <w:iCs w:val="0"/>
         </w:rPr>
-        <w:t xml:space="preserve"> use for crafting and hotbar usage.</w:t>
+        <w:t xml:space="preserve"> use for crafting and </w:t>
+      </w:r>
+      <w:proofErr w:type="spellStart"/>
+      <w:r>
+        <w:rPr>
+          <w:rStyle w:val="SubtleEmphasis"/>
+          <w:i w:val="0"/>
+          <w:iCs w:val="0"/>
+        </w:rPr>
+        <w:t>hotbar</w:t>
+      </w:r>
+      <w:proofErr w:type="spellEnd"/>
+      <w:r>
+        <w:rPr>
+          <w:rStyle w:val="SubtleEmphasis"/>
+          <w:i w:val="0"/>
+          <w:iCs w:val="0"/>
+        </w:rPr>
+        <w:t xml:space="preserve"> usage.</w:t>
       </w:r>
     </w:p>
     <w:p>
@@ -748,7 +876,7 @@
           <w:color w:val="auto"/>
         </w:rPr>
       </w:pPr>
-      <w:bookmarkStart w:id="3" w:name="_Toc220391706"/>
+      <w:bookmarkStart w:id="3" w:name="_Toc220405944"/>
       <w:r>
         <w:rPr>
           <w:rStyle w:val="SubtleEmphasis"/>
@@ -863,7 +991,13 @@
         <w:pStyle w:val="IndentNormal-Level2"/>
       </w:pPr>
       <w:r>
-        <w:t>These areas are meant as separated environments denoted by cave entrances the underground areas include:</w:t>
+        <w:t>These areas are meant as separated environments denoted by cave entrances</w:t>
+      </w:r>
+      <w:r>
+        <w:t>. T</w:t>
+      </w:r>
+      <w:r>
+        <w:t>he underground areas include:</w:t>
       </w:r>
     </w:p>
     <w:p>
@@ -975,27 +1109,47 @@
     </w:p>
     <w:p>
       <w:pPr>
-        <w:pStyle w:val="IndentNormal-Level2"/>
-      </w:pPr>
-    </w:p>
-    <w:p>
-      <w:pPr>
-        <w:pStyle w:val="Heading1"/>
+        <w:spacing w:line="278" w:lineRule="auto"/>
+        <w:jc w:val="left"/>
+        <w:rPr>
+          <w:rStyle w:val="SubtleEmphasis"/>
+          <w:rFonts w:eastAsiaTheme="majorEastAsia" w:cstheme="majorBidi"/>
+          <w:b/>
+          <w:i w:val="0"/>
+          <w:iCs w:val="0"/>
+          <w:color w:val="auto"/>
+          <w:szCs w:val="40"/>
+        </w:rPr>
+      </w:pPr>
+      <w:r>
         <w:rPr>
           <w:rStyle w:val="SubtleEmphasis"/>
           <w:i w:val="0"/>
           <w:iCs w:val="0"/>
           <w:color w:val="auto"/>
         </w:rPr>
-      </w:pPr>
-      <w:bookmarkStart w:id="4" w:name="_Toc220391707"/>
-      <w:r>
+        <w:br w:type="page"/>
+      </w:r>
+    </w:p>
+    <w:p>
+      <w:pPr>
+        <w:pStyle w:val="Heading1"/>
         <w:rPr>
           <w:rStyle w:val="SubtleEmphasis"/>
           <w:i w:val="0"/>
           <w:iCs w:val="0"/>
           <w:color w:val="auto"/>
         </w:rPr>
+      </w:pPr>
+      <w:bookmarkStart w:id="4" w:name="_Toc220405945"/>
+      <w:r>
+        <w:rPr>
+          <w:rStyle w:val="SubtleEmphasis"/>
+          <w:i w:val="0"/>
+          <w:iCs w:val="0"/>
+          <w:color w:val="auto"/>
+        </w:rPr>
+        <w:lastRenderedPageBreak/>
         <w:t>Core Gameplay Mechanics</w:t>
       </w:r>
       <w:bookmarkEnd w:id="4"/>
@@ -1045,40 +1199,63 @@
         <w:pStyle w:val="IndentNormal"/>
       </w:pPr>
       <w:r>
-        <w:t>The game autosaves at crucical moments and periodically.</w:t>
+        <w:t xml:space="preserve">The game autosaves at </w:t>
+      </w:r>
+      <w:r>
+        <w:t>crucial</w:t>
+      </w:r>
+      <w:r>
+        <w:t xml:space="preserve"> moments and periodically.</w:t>
       </w:r>
     </w:p>
     <w:p>
       <w:pPr>
         <w:pStyle w:val="ListParagraph"/>
       </w:pPr>
+      <w:proofErr w:type="spellStart"/>
       <w:r>
         <w:t>Automatica</w:t>
       </w:r>
+      <w:proofErr w:type="spellEnd"/>
     </w:p>
     <w:p>
       <w:pPr>
         <w:pStyle w:val="IndentNormal"/>
       </w:pPr>
       <w:r>
-        <w:t>Robot-like craftables that allow the user to automate certain processes by programming it through Lua, unlockable through the Lua-focused challenge areas.</w:t>
+        <w:t xml:space="preserve">Robot-like </w:t>
+      </w:r>
+      <w:proofErr w:type="spellStart"/>
+      <w:r>
+        <w:t>craftables</w:t>
+      </w:r>
+      <w:proofErr w:type="spellEnd"/>
+      <w:r>
+        <w:t xml:space="preserve"> that allow the user to automate certain processes by programming it through Lua, unlockable through the Lua-focused challenge areas.</w:t>
       </w:r>
     </w:p>
     <w:p>
       <w:pPr>
         <w:pStyle w:val="IndentNormal"/>
       </w:pPr>
-      <w:r>
-        <w:t>Automaticas can be used to automate interaction with objects and aid the player in combat.</w:t>
+      <w:proofErr w:type="spellStart"/>
+      <w:r>
+        <w:t>Automaticas</w:t>
+      </w:r>
+      <w:proofErr w:type="spellEnd"/>
+      <w:r>
+        <w:t xml:space="preserve"> can be used to automate interaction with objects and aid the player in combat.</w:t>
       </w:r>
     </w:p>
     <w:p>
       <w:pPr>
         <w:pStyle w:val="ListParagraph"/>
       </w:pPr>
+      <w:proofErr w:type="spellStart"/>
       <w:r>
         <w:t>Algorithmica</w:t>
       </w:r>
+      <w:proofErr w:type="spellEnd"/>
     </w:p>
     <w:p>
       <w:pPr>
@@ -1168,9 +1345,11 @@
       <w:r>
         <w:t xml:space="preserve">Lua programming language is used for programming </w:t>
       </w:r>
+      <w:proofErr w:type="spellStart"/>
       <w:r>
         <w:t>Automatica</w:t>
       </w:r>
+      <w:proofErr w:type="spellEnd"/>
       <w:r>
         <w:t xml:space="preserve"> within the game.</w:t>
       </w:r>
@@ -1188,11 +1367,18 @@
         <w:pStyle w:val="IndentNormal-Level2"/>
       </w:pPr>
       <w:r>
-        <w:lastRenderedPageBreak/>
         <w:t>Python programming language is used for programming automat</w:t>
       </w:r>
       <w:r>
-        <w:t>ion for Algorithmica within the game.</w:t>
+        <w:t xml:space="preserve">ion for </w:t>
+      </w:r>
+      <w:proofErr w:type="spellStart"/>
+      <w:r>
+        <w:t>Algorithmica</w:t>
+      </w:r>
+      <w:proofErr w:type="spellEnd"/>
+      <w:r>
+        <w:t xml:space="preserve"> within the game.</w:t>
       </w:r>
     </w:p>
     <w:p>
@@ -1313,7 +1499,42 @@
         <w:pStyle w:val="IndentNormal"/>
       </w:pPr>
       <w:r>
-        <w:t>Progression can be measured by coding knowledge of the player, the more coding he can do the more utility he can add to the Automatica and Algorithmica. Adding code to automatica allows it to be automated and adding code to Algorithmica allows items to have more damage and inflict additional effects.</w:t>
+        <w:t xml:space="preserve">Progression can be measured by coding knowledge of the player, the more coding he can do the more utility he can add to the </w:t>
+      </w:r>
+      <w:proofErr w:type="spellStart"/>
+      <w:r>
+        <w:t>Automatica</w:t>
+      </w:r>
+      <w:proofErr w:type="spellEnd"/>
+      <w:r>
+        <w:t xml:space="preserve"> and </w:t>
+      </w:r>
+      <w:proofErr w:type="spellStart"/>
+      <w:r>
+        <w:t>Algorithmica</w:t>
+      </w:r>
+      <w:proofErr w:type="spellEnd"/>
+      <w:r>
+        <w:t xml:space="preserve">. Adding code to </w:t>
+      </w:r>
+      <w:proofErr w:type="spellStart"/>
+      <w:r>
+        <w:t>A</w:t>
+      </w:r>
+      <w:r>
+        <w:t>utomatica</w:t>
+      </w:r>
+      <w:proofErr w:type="spellEnd"/>
+      <w:r>
+        <w:t xml:space="preserve"> allows it to be automated and adding code to </w:t>
+      </w:r>
+      <w:proofErr w:type="spellStart"/>
+      <w:r>
+        <w:t>Algorithmica</w:t>
+      </w:r>
+      <w:proofErr w:type="spellEnd"/>
+      <w:r>
+        <w:t xml:space="preserve"> allows items to have more damage and inflict additional effects.</w:t>
       </w:r>
     </w:p>
     <w:p>
@@ -1329,7 +1550,7 @@
       <w:pPr>
         <w:pStyle w:val="Heading1"/>
       </w:pPr>
-      <w:bookmarkStart w:id="5" w:name="_Toc220391708"/>
+      <w:bookmarkStart w:id="5" w:name="_Toc220405946"/>
       <w:r>
         <w:lastRenderedPageBreak/>
         <w:t>Gameplay</w:t>
@@ -1398,10 +1619,12 @@
       <w:pPr>
         <w:pStyle w:val="Heading1"/>
       </w:pPr>
+      <w:bookmarkStart w:id="6" w:name="_Toc220405947"/>
       <w:r>
         <w:lastRenderedPageBreak/>
         <w:t>Storyboard</w:t>
       </w:r>
+      <w:bookmarkEnd w:id="6"/>
     </w:p>
     <w:p>
       <w:r>
@@ -1646,7 +1869,7 @@
       </w:r>
     </w:p>
     <w:sectPr>
-      <w:pgSz w:w="12240" w:h="15840"/>
+      <w:pgSz w:w="11906" w:h="16838" w:code="9"/>
       <w:pgMar w:top="1440" w:right="1440" w:bottom="1440" w:left="1440" w:header="708" w:footer="708" w:gutter="0"/>
       <w:cols w:space="708"/>
       <w:docGrid w:linePitch="360"/>

</xml_diff>